<commit_message>
Update PDAN8411 Part 1 - ST10467199 - Report.docx
Add the GitHub path to the report.
</commit_message>
<xml_diff>
--- a/PDAN8411 Part 1 - ST10467199 - Report.docx
+++ b/PDAN8411 Part 1 - ST10467199 - Report.docx
@@ -557,15 +557,7 @@
                                     <w:sz w:val="40"/>
                                     <w:szCs w:val="40"/>
                                   </w:rPr>
-                                  <w:t xml:space="preserve"> </w:t>
-                                </w:r>
-                                <w:r>
-                                  <w:rPr>
-                                    <w:color w:val="7F7F7F" w:themeColor="text1" w:themeTint="80"/>
-                                    <w:sz w:val="40"/>
-                                    <w:szCs w:val="40"/>
-                                  </w:rPr>
-                                  <w:t>21 April 2026</w:t>
+                                  <w:t xml:space="preserve"> 21 April 2026</w:t>
                                 </w:r>
                               </w:p>
                               <w:p>
@@ -865,15 +857,7 @@
                               <w:sz w:val="40"/>
                               <w:szCs w:val="40"/>
                             </w:rPr>
-                            <w:t xml:space="preserve"> </w:t>
-                          </w:r>
-                          <w:r>
-                            <w:rPr>
-                              <w:color w:val="7F7F7F" w:themeColor="text1" w:themeTint="80"/>
-                              <w:sz w:val="40"/>
-                              <w:szCs w:val="40"/>
-                            </w:rPr>
-                            <w:t>21 April 2026</w:t>
+                            <w:t xml:space="preserve"> 21 April 2026</w:t>
                           </w:r>
                         </w:p>
                         <w:p>
@@ -987,7 +971,7 @@
                 <o:lock v:ext="edit" aspectratio="f"/>
                 <w10:wrap type="square" side="right"/>
               </v:shape>
-              <o:OLEObject Type="Embed" ProgID="StaticMetafile" ShapeID="_x0000_s1027" DrawAspect="Content" ObjectID="_1838290993" r:id="rId11"/>
+              <o:OLEObject Type="Embed" ProgID="StaticMetafile" ShapeID="_x0000_s1027" DrawAspect="Content" ObjectID="_1838315050" r:id="rId11"/>
             </w:object>
           </w:r>
           <w:r>
@@ -2556,6 +2540,48 @@
         </w:rPr>
         <w:t>GitHub Link:</w:t>
       </w:r>
+      <w:r>
+        <w:rPr>
+          <w:rFonts w:cstheme="minorHAnsi"/>
+          <w:b/>
+          <w:bCs/>
+          <w:lang w:val="en-ZA" w:eastAsia="en-ZA"/>
+        </w:rPr>
+        <w:t xml:space="preserve"> </w:t>
+      </w:r>
+    </w:p>
+    <w:p>
+      <w:pPr>
+        <w:spacing w:line="360" w:lineRule="auto"/>
+        <w:jc w:val="both"/>
+        <w:rPr>
+          <w:rFonts w:cstheme="minorHAnsi"/>
+          <w:b/>
+          <w:bCs/>
+          <w:lang w:val="en-ZA" w:eastAsia="en-ZA"/>
+        </w:rPr>
+      </w:pPr>
+      <w:r>
+        <w:rPr>
+          <w:rFonts w:cstheme="minorHAnsi"/>
+          <w:b/>
+          <w:bCs/>
+          <w:lang w:val="en-ZA" w:eastAsia="en-ZA"/>
+        </w:rPr>
+        <w:t>https://github.com/ST10467199/Part1/commit/c6edbacfb24e98148e356f5d17958aa4e48bf772</w:t>
+      </w:r>
+    </w:p>
+    <w:p>
+      <w:pPr>
+        <w:spacing w:line="360" w:lineRule="auto"/>
+        <w:jc w:val="both"/>
+        <w:rPr>
+          <w:rFonts w:cstheme="minorHAnsi"/>
+          <w:b/>
+          <w:bCs/>
+          <w:lang w:val="en-ZA" w:eastAsia="en-ZA"/>
+        </w:rPr>
+      </w:pPr>
     </w:p>
     <w:p>
       <w:pPr>
@@ -3257,6 +3283,7 @@
           <w:szCs w:val="22"/>
           <w:lang w:val="en-ZA"/>
         </w:rPr>
+        <w:lastRenderedPageBreak/>
         <w:t>The target variable charges </w:t>
       </w:r>
       <w:r>
@@ -3309,7 +3336,6 @@
           <w:szCs w:val="22"/>
           <w:lang w:val="en-ZA"/>
         </w:rPr>
-        <w:lastRenderedPageBreak/>
         <w:t>The features were standardised using StandardScaler to ensure all predictors were</w:t>
       </w:r>
       <w:r>
@@ -3738,7 +3764,17 @@
           <w:szCs w:val="22"/>
           <w:lang w:val="en-ZA"/>
         </w:rPr>
-        <w:t xml:space="preserve"> log-transformed to address skewness, and all features were standardised using StandardScaler. The model was trained using model.fit(X_train, y_train) and predictions were made using model.predict(X_test). No hyperparameter tuning was </w:t>
+        <w:t xml:space="preserve"> log-transformed to address skewness, and all </w:t>
+      </w:r>
+      <w:r>
+        <w:rPr>
+          <w:rFonts w:cstheme="minorHAnsi"/>
+          <w:sz w:val="22"/>
+          <w:szCs w:val="22"/>
+          <w:lang w:val="en-ZA"/>
+        </w:rPr>
+        <w:lastRenderedPageBreak/>
+        <w:t xml:space="preserve">features were standardised using StandardScaler. The model was trained using model.fit(X_train, y_train) and predictions were made using model.predict(X_test). No hyperparameter tuning was </w:t>
       </w:r>
       <w:r>
         <w:rPr>
@@ -3803,7 +3839,6 @@
           <w:sz w:val="24"/>
           <w:szCs w:val="24"/>
         </w:rPr>
-        <w:lastRenderedPageBreak/>
         <w:t>Visualisations</w:t>
       </w:r>
       <w:bookmarkEnd w:id="7"/>
@@ -3958,6 +3993,7 @@
           <w:szCs w:val="22"/>
           <w:lang w:val="en-ZA"/>
         </w:rPr>
+        <w:lastRenderedPageBreak/>
         <w:drawing>
           <wp:inline distT="0" distB="0" distL="0" distR="0" wp14:anchorId="1F1F7207" wp14:editId="14662C1F">
             <wp:extent cx="4648234" cy="3676677"/>
@@ -4016,7 +4052,6 @@
           <w:szCs w:val="22"/>
           <w:lang w:val="en-ZA"/>
         </w:rPr>
-        <w:lastRenderedPageBreak/>
         <w:t>Figure 2: Boxplot of Charges by Smoking Status</w:t>
       </w:r>
       <w:r>
@@ -4199,6 +4234,7 @@
           <w:sz w:val="24"/>
           <w:szCs w:val="24"/>
         </w:rPr>
+        <w:lastRenderedPageBreak/>
         <w:t>Model Interpretation</w:t>
       </w:r>
       <w:bookmarkEnd w:id="8"/>
@@ -4246,7 +4282,6 @@
           <w:szCs w:val="24"/>
           <w:lang w:val="en-ZA"/>
         </w:rPr>
-        <w:lastRenderedPageBreak/>
         <w:t>Coefficient Table:</w:t>
       </w:r>
       <w:bookmarkEnd w:id="9"/>
@@ -5271,6 +5306,7 @@
                 <w:lang w:val="en-ZA"/>
               </w:rPr>
             </w:pPr>
+            <w:proofErr w:type="spellStart"/>
             <w:r>
               <w:rPr>
                 <w:rFonts w:cstheme="minorHAnsi"/>
@@ -5280,6 +5316,7 @@
               </w:rPr>
               <w:t>Region_southeast</w:t>
             </w:r>
+            <w:proofErr w:type="spellEnd"/>
           </w:p>
         </w:tc>
         <w:tc>
@@ -5429,6 +5466,7 @@
                 <w:lang w:val="en-ZA"/>
               </w:rPr>
             </w:pPr>
+            <w:proofErr w:type="spellStart"/>
             <w:r>
               <w:rPr>
                 <w:rFonts w:cstheme="minorHAnsi"/>
@@ -5438,6 +5476,7 @@
               </w:rPr>
               <w:t>Region_southwest</w:t>
             </w:r>
+            <w:proofErr w:type="spellEnd"/>
           </w:p>
         </w:tc>
         <w:tc>
@@ -5666,7 +5705,27 @@
           <w:szCs w:val="22"/>
           <w:lang w:val="en-ZA"/>
         </w:rPr>
-        <w:t>× sex_male) + (</w:t>
+        <w:t xml:space="preserve">× </w:t>
+      </w:r>
+      <w:proofErr w:type="spellStart"/>
+      <w:r>
+        <w:rPr>
+          <w:rFonts w:cstheme="minorHAnsi"/>
+          <w:sz w:val="22"/>
+          <w:szCs w:val="22"/>
+          <w:lang w:val="en-ZA"/>
+        </w:rPr>
+        <w:t>sex_male</w:t>
+      </w:r>
+      <w:proofErr w:type="spellEnd"/>
+      <w:r>
+        <w:rPr>
+          <w:rFonts w:cstheme="minorHAnsi"/>
+          <w:sz w:val="22"/>
+          <w:szCs w:val="22"/>
+          <w:lang w:val="en-ZA"/>
+        </w:rPr>
+        <w:t>) + (</w:t>
       </w:r>
       <w:r>
         <w:rPr>
@@ -5684,7 +5743,27 @@
           <w:szCs w:val="22"/>
           <w:lang w:val="en-ZA"/>
         </w:rPr>
-        <w:t xml:space="preserve">× bmi) </w:t>
+        <w:t xml:space="preserve">× </w:t>
+      </w:r>
+      <w:proofErr w:type="spellStart"/>
+      <w:r>
+        <w:rPr>
+          <w:rFonts w:cstheme="minorHAnsi"/>
+          <w:sz w:val="22"/>
+          <w:szCs w:val="22"/>
+          <w:lang w:val="en-ZA"/>
+        </w:rPr>
+        <w:t>bmi</w:t>
+      </w:r>
+      <w:proofErr w:type="spellEnd"/>
+      <w:r>
+        <w:rPr>
+          <w:rFonts w:cstheme="minorHAnsi"/>
+          <w:sz w:val="22"/>
+          <w:szCs w:val="22"/>
+          <w:lang w:val="en-ZA"/>
+        </w:rPr>
+        <w:t xml:space="preserve">) </w:t>
       </w:r>
     </w:p>
     <w:p>
@@ -5778,7 +5857,17 @@
           <w:szCs w:val="22"/>
           <w:lang w:val="en-ZA"/>
         </w:rPr>
-        <w:t>× region_</w:t>
+        <w:t xml:space="preserve">× </w:t>
+      </w:r>
+      <w:proofErr w:type="spellStart"/>
+      <w:r>
+        <w:rPr>
+          <w:rFonts w:cstheme="minorHAnsi"/>
+          <w:sz w:val="22"/>
+          <w:szCs w:val="22"/>
+          <w:lang w:val="en-ZA"/>
+        </w:rPr>
+        <w:t>region_</w:t>
       </w:r>
       <w:r>
         <w:rPr>
@@ -5789,6 +5878,7 @@
         </w:rPr>
         <w:t>southeast</w:t>
       </w:r>
+      <w:proofErr w:type="spellEnd"/>
       <w:r>
         <w:rPr>
           <w:rFonts w:cstheme="minorHAnsi"/>
@@ -5823,7 +5913,27 @@
           <w:szCs w:val="22"/>
           <w:lang w:val="en-ZA"/>
         </w:rPr>
-        <w:t xml:space="preserve"> (-0.0340 × region_southwest)</w:t>
+        <w:t xml:space="preserve"> (-0.0340 × </w:t>
+      </w:r>
+      <w:proofErr w:type="spellStart"/>
+      <w:r>
+        <w:rPr>
+          <w:rFonts w:cstheme="minorHAnsi"/>
+          <w:sz w:val="22"/>
+          <w:szCs w:val="22"/>
+          <w:lang w:val="en-ZA"/>
+        </w:rPr>
+        <w:t>region_southwest</w:t>
+      </w:r>
+      <w:proofErr w:type="spellEnd"/>
+      <w:r>
+        <w:rPr>
+          <w:rFonts w:cstheme="minorHAnsi"/>
+          <w:sz w:val="22"/>
+          <w:szCs w:val="22"/>
+          <w:lang w:val="en-ZA"/>
+        </w:rPr>
+        <w:t>)</w:t>
       </w:r>
     </w:p>
     <w:p>
@@ -5982,6 +6092,7 @@
           <w:sz w:val="24"/>
           <w:szCs w:val="24"/>
         </w:rPr>
+        <w:lastRenderedPageBreak/>
         <w:t>Model Performance</w:t>
       </w:r>
       <w:bookmarkEnd w:id="11"/>
@@ -6067,7 +6178,6 @@
                 <w:bCs/>
                 <w:lang w:val="en-ZA"/>
               </w:rPr>
-              <w:lastRenderedPageBreak/>
               <w:t>Metric</w:t>
             </w:r>
           </w:p>

</xml_diff>